<commit_message>
refactor(PhysicalWeight): 物理称重 DDD 重构 - 旧 PhysicalWeightRecord 实体/服务迁移为 DDD 聚合根结构 - 新增 PhysicalWeightRecordPo 持久化实体及 DbContext 新列(TestType/LengthCm/PieceCount/SampleId 等) - 新增报告生成引擎 PhysicalWeightDocxEngine + 报告控制器 - WordTemplateEngine 抽取公共方法到 TextRunHelper - 更新 PHY_Weight.docx 模板及新增 SQL 脚本
</commit_message>
<xml_diff>
--- a/wwwroot/DocxModel/PHY_Weight.docx
+++ b/wwwroot/DocxModel/PHY_Weight.docx
@@ -32,9 +32,15 @@
         <w:tblLook w:val="04A0" w:firstRow="1" w:lastRow="0" w:firstColumn="1" w:lastColumn="0" w:noHBand="0" w:noVBand="1"/>
       </w:tblPr>
       <w:tblGrid>
-        <w:gridCol w:w="1843"/>
+        <w:gridCol w:w="1985"/>
+        <w:gridCol w:w="425"/>
         <w:gridCol w:w="567"/>
-        <w:gridCol w:w="8080"/>
+        <w:gridCol w:w="992"/>
+        <w:gridCol w:w="992"/>
+        <w:gridCol w:w="993"/>
+        <w:gridCol w:w="2268"/>
+        <w:gridCol w:w="1134"/>
+        <w:gridCol w:w="1134"/>
       </w:tblGrid>
       <w:tr>
         <w:trPr>
@@ -78,18 +84,19 @@
         <w:tc>
           <w:tcPr>
             <w:tcW w:w="8080" w:type="dxa"/>
-          </w:tcPr>
-          <w:p>
-            <w:pPr>
-              <w:spacing w:after="0" w:line="240" w:lineRule="auto"/>
-              <w:rPr>
-                <w:rFonts w:ascii="Arial" w:eastAsia="黑体" w:hAnsi="Arial" w:cs="Arial"/>
-                <w:sz w:val="18"/>
-                <w:szCs w:val="18"/>
-              </w:rPr>
-            </w:pPr>
-            <w:bookmarkStart w:id="2" w:name="Methods"/>
-            <w:bookmarkEnd w:id="2"/>
+            <w:gridSpan w:val="7"/>
+          </w:tcPr>
+          <w:p>
+            <w:pPr>
+              <w:spacing w:after="0" w:line="240" w:lineRule="auto"/>
+              <w:jc w:val="center"/>
+              <w:rPr>
+                <w:rFonts w:ascii="Arial" w:eastAsia="黑体" w:hAnsi="Arial" w:cs="Arial"/>
+                <w:i/>
+                <w:iCs/>
+                <w:u w:val="single"/>
+              </w:rPr>
+            </w:pPr>
           </w:p>
         </w:tc>
       </w:tr>
@@ -101,7 +108,7 @@
         <w:tc>
           <w:tcPr>
             <w:tcW w:w="10490" w:type="dxa"/>
-            <w:gridSpan w:val="3"/>
+            <w:gridSpan w:val="9"/>
             <w:shd w:val="thinDiagCross" w:color="D9D9D9" w:themeColor="background1" w:themeShade="D9" w:fill="FFFFFF" w:themeFill="background1"/>
           </w:tcPr>
           <w:p>
@@ -125,7 +132,7 @@
         <w:tc>
           <w:tcPr>
             <w:tcW w:w="10490" w:type="dxa"/>
-            <w:gridSpan w:val="3"/>
+            <w:gridSpan w:val="9"/>
           </w:tcPr>
           <w:p>
             <w:pPr>
@@ -148,7 +155,7 @@
         <w:tc>
           <w:tcPr>
             <w:tcW w:w="10490" w:type="dxa"/>
-            <w:gridSpan w:val="3"/>
+            <w:gridSpan w:val="9"/>
           </w:tcPr>
           <w:p>
             <w:pPr>
@@ -160,16 +167,6 @@
                 <w:u w:val="single"/>
               </w:rPr>
             </w:pPr>
-            <w:bookmarkStart w:id="3" w:name="GSMTrail1"/>
-            <w:bookmarkStart w:id="4" w:name="RateTrail1"/>
-            <w:bookmarkStart w:id="5" w:name="GSMTrail2"/>
-            <w:bookmarkStart w:id="6" w:name="RateTrail2"/>
-            <w:bookmarkStart w:id="7" w:name="Rate"/>
-            <w:bookmarkEnd w:id="3"/>
-            <w:bookmarkEnd w:id="4"/>
-            <w:bookmarkEnd w:id="5"/>
-            <w:bookmarkEnd w:id="6"/>
-            <w:bookmarkEnd w:id="7"/>
             <w:r>
               <w:rPr>
                 <w:rFonts w:ascii="Arial" w:hAnsi="Arial" w:cs="Arial" w:hint="eastAsia"/>
@@ -177,7 +174,16 @@
                 <w:bCs/>
                 <w:u w:val="single"/>
               </w:rPr>
-              <w:t>Fabric Weight Per Unit Area</w:t>
+              <w:t xml:space="preserve">Fabric Weight Per Unit </w:t>
+            </w:r>
+            <w:r>
+              <w:rPr>
+                <w:rFonts w:ascii="Arial" w:hAnsi="Arial" w:cs="Arial" w:hint="eastAsia"/>
+                <w:b/>
+                <w:bCs/>
+                <w:u w:val="single"/>
+              </w:rPr>
+              <w:t>Area</w:t>
             </w:r>
           </w:p>
         </w:tc>
@@ -190,7 +196,7 @@
         <w:tc>
           <w:tcPr>
             <w:tcW w:w="10490" w:type="dxa"/>
-            <w:gridSpan w:val="3"/>
+            <w:gridSpan w:val="9"/>
           </w:tcPr>
           <w:p>
             <w:pPr>
@@ -214,7 +220,7 @@
         </w:trPr>
         <w:tc>
           <w:tcPr>
-            <w:tcW w:w="1843" w:type="dxa"/>
+            <w:tcW w:w="1985" w:type="dxa"/>
           </w:tcPr>
           <w:p>
             <w:pPr>
@@ -240,8 +246,8 @@
         </w:tc>
         <w:tc>
           <w:tcPr>
-            <w:tcW w:w="8647" w:type="dxa"/>
-            <w:gridSpan w:val="2"/>
+            <w:tcW w:w="8505" w:type="dxa"/>
+            <w:gridSpan w:val="8"/>
           </w:tcPr>
           <w:p>
             <w:pPr>
@@ -264,7 +270,7 @@
         <w:tc>
           <w:tcPr>
             <w:tcW w:w="10490" w:type="dxa"/>
-            <w:gridSpan w:val="3"/>
+            <w:gridSpan w:val="9"/>
           </w:tcPr>
           <w:p>
             <w:pPr>
@@ -285,12 +291,12 @@
         </w:trPr>
         <w:tc>
           <w:tcPr>
-            <w:tcW w:w="1843" w:type="dxa"/>
-          </w:tcPr>
-          <w:p>
-            <w:pPr>
-              <w:spacing w:after="0" w:line="240" w:lineRule="auto"/>
-              <w:jc w:val="right"/>
+            <w:tcW w:w="1985" w:type="dxa"/>
+          </w:tcPr>
+          <w:p>
+            <w:pPr>
+              <w:spacing w:after="0" w:line="240" w:lineRule="auto"/>
+              <w:jc w:val="center"/>
               <w:rPr>
                 <w:rFonts w:ascii="Arial" w:eastAsia="黑体" w:hAnsi="Arial" w:cs="Arial"/>
                 <w:color w:val="538135" w:themeColor="accent6" w:themeShade="BF"/>
@@ -298,91 +304,384 @@
                 <w:szCs w:val="20"/>
               </w:rPr>
             </w:pPr>
-            <w:bookmarkStart w:id="8" w:name="Sum_1"/>
-            <w:bookmarkStart w:id="9" w:name="GSMTrail1_1"/>
-            <w:bookmarkStart w:id="10" w:name="RateTrail1_1"/>
-            <w:bookmarkStart w:id="11" w:name="GSMTrail2_1"/>
-            <w:bookmarkStart w:id="12" w:name="RateTrail2_1"/>
-            <w:bookmarkStart w:id="13" w:name="MoistureRegain_1"/>
-            <w:bookmarkStart w:id="14" w:name="Rate_1"/>
-            <w:bookmarkEnd w:id="8"/>
-            <w:bookmarkEnd w:id="9"/>
-            <w:bookmarkEnd w:id="10"/>
-            <w:bookmarkEnd w:id="11"/>
-            <w:bookmarkEnd w:id="12"/>
-            <w:bookmarkEnd w:id="13"/>
-            <w:bookmarkEnd w:id="14"/>
             <w:r>
               <w:rPr>
-                <w:rFonts w:ascii="Arial" w:eastAsia="黑体" w:hAnsi="Arial" w:cs="Arial"/>
+                <w:rFonts w:ascii="Arial" w:eastAsia="黑体" w:hAnsi="Arial" w:cs="Arial" w:hint="eastAsia"/>
                 <w:color w:val="538135" w:themeColor="accent6" w:themeShade="BF"/>
                 <w:sz w:val="20"/>
                 <w:szCs w:val="20"/>
               </w:rPr>
-              <w:t>(g/m2 / oz/yd2)</w:t>
+              <w:t>Sample</w:t>
             </w:r>
           </w:p>
         </w:tc>
         <w:tc>
           <w:tcPr>
-            <w:tcW w:w="8647" w:type="dxa"/>
+            <w:tcW w:w="992" w:type="dxa"/>
             <w:gridSpan w:val="2"/>
           </w:tcPr>
           <w:p>
             <w:pPr>
               <w:spacing w:after="0" w:line="240" w:lineRule="auto"/>
+              <w:jc w:val="center"/>
+              <w:rPr>
+                <w:rFonts w:ascii="Arial" w:eastAsia="黑体" w:hAnsi="Arial" w:cs="Arial"/>
+                <w:color w:val="538135" w:themeColor="accent6" w:themeShade="BF"/>
+                <w:sz w:val="20"/>
+                <w:szCs w:val="20"/>
+              </w:rPr>
+            </w:pPr>
+            <w:r>
+              <w:rPr>
+                <w:rFonts w:ascii="Arial" w:eastAsia="黑体" w:hAnsi="Arial" w:cs="Arial"/>
+                <w:color w:val="538135" w:themeColor="accent6" w:themeShade="BF"/>
+                <w:sz w:val="20"/>
+                <w:szCs w:val="20"/>
+              </w:rPr>
+              <w:t>(g/m</w:t>
+            </w:r>
+            <w:r>
+              <w:rPr>
+                <w:rFonts w:eastAsia="黑体" w:cs="Calibri" w:hint="eastAsia"/>
+                <w:color w:val="538135" w:themeColor="accent6" w:themeShade="BF"/>
+                <w:sz w:val="20"/>
+                <w:szCs w:val="20"/>
+              </w:rPr>
+              <w:t>²</w:t>
+            </w:r>
+            <w:r>
+              <w:rPr>
+                <w:rFonts w:ascii="Arial" w:eastAsia="黑体" w:hAnsi="Arial" w:cs="Arial"/>
+                <w:color w:val="538135" w:themeColor="accent6" w:themeShade="BF"/>
+                <w:sz w:val="20"/>
+                <w:szCs w:val="20"/>
+              </w:rPr>
+              <w:t xml:space="preserve">  </w:t>
+            </w:r>
+          </w:p>
+        </w:tc>
+        <w:tc>
+          <w:tcPr>
+            <w:tcW w:w="992" w:type="dxa"/>
+          </w:tcPr>
+          <w:p>
+            <w:pPr>
+              <w:spacing w:after="0" w:line="240" w:lineRule="auto"/>
+              <w:jc w:val="center"/>
+              <w:rPr>
+                <w:rFonts w:ascii="Arial" w:eastAsia="黑体" w:hAnsi="Arial" w:cs="Arial"/>
+                <w:color w:val="538135" w:themeColor="accent6" w:themeShade="BF"/>
+                <w:sz w:val="20"/>
+                <w:szCs w:val="20"/>
+              </w:rPr>
+            </w:pPr>
+            <w:r>
+              <w:rPr>
+                <w:rFonts w:ascii="Arial" w:eastAsia="黑体" w:hAnsi="Arial" w:cs="Arial"/>
+                <w:color w:val="538135" w:themeColor="accent6" w:themeShade="BF"/>
+                <w:sz w:val="20"/>
+                <w:szCs w:val="20"/>
+              </w:rPr>
+              <w:t>oz/yd</w:t>
+            </w:r>
+            <w:proofErr w:type="gramStart"/>
+            <w:r>
+              <w:rPr>
+                <w:rFonts w:eastAsia="黑体" w:cs="Calibri" w:hint="eastAsia"/>
+                <w:color w:val="538135" w:themeColor="accent6" w:themeShade="BF"/>
+                <w:sz w:val="20"/>
+                <w:szCs w:val="20"/>
+              </w:rPr>
+              <w:t>²</w:t>
+            </w:r>
+            <w:r>
+              <w:rPr>
+                <w:rFonts w:ascii="Arial" w:eastAsia="黑体" w:hAnsi="Arial" w:cs="Arial"/>
+                <w:color w:val="538135" w:themeColor="accent6" w:themeShade="BF"/>
+                <w:sz w:val="20"/>
+                <w:szCs w:val="20"/>
+              </w:rPr>
+              <w:t>)</w:t>
+            </w:r>
+            <w:proofErr w:type="gramEnd"/>
+          </w:p>
+        </w:tc>
+        <w:tc>
+          <w:tcPr>
+            <w:tcW w:w="992" w:type="dxa"/>
+          </w:tcPr>
+          <w:p>
+            <w:pPr>
+              <w:spacing w:after="0" w:line="240" w:lineRule="auto"/>
+              <w:jc w:val="center"/>
               <w:rPr>
                 <w:rFonts w:ascii="Arial" w:eastAsia="黑体" w:hAnsi="Arial" w:cs="Arial"/>
                 <w:sz w:val="13"/>
                 <w:szCs w:val="13"/>
               </w:rPr>
             </w:pPr>
+            <w:r>
+              <w:rPr>
+                <w:rFonts w:ascii="Arial" w:eastAsia="黑体" w:hAnsi="Arial" w:cs="Arial"/>
+                <w:color w:val="538135" w:themeColor="accent6" w:themeShade="BF"/>
+                <w:sz w:val="20"/>
+                <w:szCs w:val="20"/>
+              </w:rPr>
+              <w:t xml:space="preserve">(g/m </w:t>
+            </w:r>
+          </w:p>
+        </w:tc>
+        <w:tc>
+          <w:tcPr>
+            <w:tcW w:w="993" w:type="dxa"/>
+          </w:tcPr>
+          <w:p>
+            <w:pPr>
+              <w:spacing w:after="0" w:line="240" w:lineRule="auto"/>
+              <w:jc w:val="center"/>
+              <w:rPr>
+                <w:rFonts w:ascii="Arial" w:eastAsia="黑体" w:hAnsi="Arial" w:cs="Arial"/>
+                <w:sz w:val="13"/>
+                <w:szCs w:val="13"/>
+              </w:rPr>
+            </w:pPr>
+            <w:r>
+              <w:rPr>
+                <w:rFonts w:ascii="Arial" w:eastAsia="黑体" w:hAnsi="Arial" w:cs="Arial"/>
+                <w:color w:val="538135" w:themeColor="accent6" w:themeShade="BF"/>
+                <w:sz w:val="20"/>
+                <w:szCs w:val="20"/>
+              </w:rPr>
+              <w:t>oz/yd)</w:t>
+            </w:r>
+          </w:p>
+        </w:tc>
+        <w:tc>
+          <w:tcPr>
+            <w:tcW w:w="2268" w:type="dxa"/>
+          </w:tcPr>
+          <w:p>
+            <w:pPr>
+              <w:spacing w:after="0" w:line="240" w:lineRule="auto"/>
+              <w:jc w:val="center"/>
+              <w:rPr>
+                <w:rFonts w:ascii="Arial" w:eastAsia="黑体" w:hAnsi="Arial" w:cs="Arial"/>
+                <w:sz w:val="13"/>
+                <w:szCs w:val="13"/>
+              </w:rPr>
+            </w:pPr>
+            <w:r>
+              <w:rPr>
+                <w:rFonts w:ascii="Arial" w:eastAsia="黑体" w:hAnsi="Arial" w:cs="Arial"/>
+                <w:color w:val="538135" w:themeColor="accent6" w:themeShade="BF"/>
+                <w:sz w:val="20"/>
+                <w:szCs w:val="20"/>
+              </w:rPr>
+              <w:t>(g/linear meter)</w:t>
+            </w:r>
+          </w:p>
+        </w:tc>
+        <w:tc>
+          <w:tcPr>
+            <w:tcW w:w="1134" w:type="dxa"/>
+          </w:tcPr>
+          <w:p>
+            <w:pPr>
+              <w:spacing w:after="0" w:line="240" w:lineRule="auto"/>
+              <w:jc w:val="center"/>
+              <w:rPr>
+                <w:rFonts w:ascii="Arial" w:eastAsia="黑体" w:hAnsi="Arial" w:cs="Arial"/>
+                <w:sz w:val="13"/>
+                <w:szCs w:val="13"/>
+              </w:rPr>
+            </w:pPr>
+            <w:r>
+              <w:rPr>
+                <w:rFonts w:ascii="Arial" w:eastAsia="黑体" w:hAnsi="Arial" w:cs="Arial" w:hint="eastAsia"/>
+                <w:color w:val="538135" w:themeColor="accent6" w:themeShade="BF"/>
+                <w:sz w:val="20"/>
+                <w:szCs w:val="20"/>
+              </w:rPr>
+              <w:t xml:space="preserve">(g/piece </w:t>
+            </w:r>
+          </w:p>
+        </w:tc>
+        <w:tc>
+          <w:tcPr>
+            <w:tcW w:w="1134" w:type="dxa"/>
+          </w:tcPr>
+          <w:p>
+            <w:pPr>
+              <w:spacing w:after="0" w:line="240" w:lineRule="auto"/>
+              <w:jc w:val="center"/>
+              <w:rPr>
+                <w:rFonts w:ascii="Arial" w:eastAsia="黑体" w:hAnsi="Arial" w:cs="Arial"/>
+                <w:sz w:val="13"/>
+                <w:szCs w:val="13"/>
+              </w:rPr>
+            </w:pPr>
+            <w:proofErr w:type="spellStart"/>
+            <w:r>
+              <w:rPr>
+                <w:rFonts w:ascii="Arial" w:eastAsia="黑体" w:hAnsi="Arial" w:cs="Arial" w:hint="eastAsia"/>
+                <w:color w:val="538135" w:themeColor="accent6" w:themeShade="BF"/>
+                <w:sz w:val="20"/>
+                <w:szCs w:val="20"/>
+              </w:rPr>
+              <w:t>l</w:t>
+            </w:r>
+            <w:r>
+              <w:rPr>
+                <w:rFonts w:ascii="Arial" w:eastAsia="黑体" w:hAnsi="Arial" w:cs="Arial" w:hint="eastAsia"/>
+                <w:color w:val="538135" w:themeColor="accent6" w:themeShade="BF"/>
+                <w:sz w:val="20"/>
+                <w:szCs w:val="20"/>
+              </w:rPr>
+              <w:t>b</w:t>
+            </w:r>
+            <w:proofErr w:type="spellEnd"/>
+            <w:r>
+              <w:rPr>
+                <w:rFonts w:ascii="Arial" w:eastAsia="黑体" w:hAnsi="Arial" w:cs="Arial" w:hint="eastAsia"/>
+                <w:color w:val="538135" w:themeColor="accent6" w:themeShade="BF"/>
+                <w:sz w:val="20"/>
+                <w:szCs w:val="20"/>
+              </w:rPr>
+              <w:t>/dozen)</w:t>
+            </w:r>
           </w:p>
         </w:tc>
       </w:tr>
       <w:tr>
         <w:trPr>
-          <w:trHeight w:val="191"/>
+          <w:trHeight w:val="138"/>
           <w:jc w:val="center"/>
         </w:trPr>
         <w:tc>
           <w:tcPr>
-            <w:tcW w:w="1843" w:type="dxa"/>
-          </w:tcPr>
-          <w:p>
-            <w:pPr>
-              <w:spacing w:after="0" w:line="240" w:lineRule="auto"/>
-              <w:jc w:val="right"/>
-              <w:rPr>
-                <w:rFonts w:ascii="Arial" w:eastAsia="黑体" w:hAnsi="Arial" w:cs="Arial"/>
-                <w:color w:val="538135" w:themeColor="accent6" w:themeShade="BF"/>
-                <w:sz w:val="20"/>
-                <w:szCs w:val="20"/>
-              </w:rPr>
-            </w:pPr>
-            <w:r>
-              <w:rPr>
-                <w:rFonts w:ascii="Arial" w:eastAsia="黑体" w:hAnsi="Arial" w:cs="Arial"/>
-                <w:color w:val="538135" w:themeColor="accent6" w:themeShade="BF"/>
-                <w:sz w:val="20"/>
-                <w:szCs w:val="20"/>
-              </w:rPr>
-              <w:t>(g/m / oz/yd)</w:t>
-            </w:r>
-          </w:p>
-        </w:tc>
-        <w:tc>
-          <w:tcPr>
-            <w:tcW w:w="8647" w:type="dxa"/>
+            <w:tcW w:w="1985" w:type="dxa"/>
+          </w:tcPr>
+          <w:p>
+            <w:pPr>
+              <w:spacing w:after="0" w:line="240" w:lineRule="auto"/>
+              <w:jc w:val="center"/>
+              <w:rPr>
+                <w:rFonts w:ascii="Arial" w:eastAsia="黑体" w:hAnsi="Arial" w:cs="Arial"/>
+                <w:sz w:val="20"/>
+                <w:szCs w:val="20"/>
+              </w:rPr>
+            </w:pPr>
+          </w:p>
+        </w:tc>
+        <w:tc>
+          <w:tcPr>
+            <w:tcW w:w="992" w:type="dxa"/>
             <w:gridSpan w:val="2"/>
           </w:tcPr>
           <w:p>
             <w:pPr>
               <w:spacing w:after="0" w:line="240" w:lineRule="auto"/>
-              <w:rPr>
-                <w:rFonts w:ascii="Arial" w:eastAsia="黑体" w:hAnsi="Arial" w:cs="Arial"/>
-                <w:sz w:val="13"/>
-                <w:szCs w:val="13"/>
+              <w:jc w:val="center"/>
+              <w:rPr>
+                <w:rFonts w:ascii="Arial" w:eastAsia="黑体" w:hAnsi="Arial" w:cs="Arial"/>
+                <w:sz w:val="20"/>
+                <w:szCs w:val="20"/>
+              </w:rPr>
+            </w:pPr>
+          </w:p>
+        </w:tc>
+        <w:tc>
+          <w:tcPr>
+            <w:tcW w:w="992" w:type="dxa"/>
+          </w:tcPr>
+          <w:p>
+            <w:pPr>
+              <w:spacing w:after="0" w:line="240" w:lineRule="auto"/>
+              <w:jc w:val="center"/>
+              <w:rPr>
+                <w:rFonts w:ascii="Arial" w:eastAsia="黑体" w:hAnsi="Arial" w:cs="Arial"/>
+                <w:sz w:val="20"/>
+                <w:szCs w:val="20"/>
+              </w:rPr>
+            </w:pPr>
+          </w:p>
+        </w:tc>
+        <w:tc>
+          <w:tcPr>
+            <w:tcW w:w="992" w:type="dxa"/>
+          </w:tcPr>
+          <w:p>
+            <w:pPr>
+              <w:spacing w:after="0" w:line="240" w:lineRule="auto"/>
+              <w:jc w:val="center"/>
+              <w:rPr>
+                <w:rFonts w:ascii="Arial" w:eastAsia="黑体" w:hAnsi="Arial" w:cs="Arial"/>
+                <w:sz w:val="20"/>
+                <w:szCs w:val="20"/>
+              </w:rPr>
+            </w:pPr>
+          </w:p>
+        </w:tc>
+        <w:tc>
+          <w:tcPr>
+            <w:tcW w:w="993" w:type="dxa"/>
+          </w:tcPr>
+          <w:p>
+            <w:pPr>
+              <w:spacing w:after="0" w:line="240" w:lineRule="auto"/>
+              <w:jc w:val="center"/>
+              <w:rPr>
+                <w:rFonts w:ascii="Arial" w:eastAsia="黑体" w:hAnsi="Arial" w:cs="Arial"/>
+                <w:sz w:val="20"/>
+                <w:szCs w:val="20"/>
+              </w:rPr>
+            </w:pPr>
+          </w:p>
+        </w:tc>
+        <w:tc>
+          <w:tcPr>
+            <w:tcW w:w="2268" w:type="dxa"/>
+          </w:tcPr>
+          <w:p>
+            <w:pPr>
+              <w:spacing w:after="0" w:line="240" w:lineRule="auto"/>
+              <w:jc w:val="center"/>
+              <w:rPr>
+                <w:rFonts w:ascii="Arial" w:eastAsia="黑体" w:hAnsi="Arial" w:cs="Arial"/>
+                <w:sz w:val="20"/>
+                <w:szCs w:val="20"/>
+              </w:rPr>
+            </w:pPr>
+          </w:p>
+        </w:tc>
+        <w:tc>
+          <w:tcPr>
+            <w:tcW w:w="1134" w:type="dxa"/>
+          </w:tcPr>
+          <w:p>
+            <w:pPr>
+              <w:spacing w:after="0" w:line="240" w:lineRule="auto"/>
+              <w:jc w:val="center"/>
+              <w:rPr>
+                <w:rFonts w:ascii="Arial" w:eastAsia="黑体" w:hAnsi="Arial" w:cs="Arial"/>
+                <w:sz w:val="20"/>
+                <w:szCs w:val="20"/>
+              </w:rPr>
+            </w:pPr>
+          </w:p>
+        </w:tc>
+        <w:tc>
+          <w:tcPr>
+            <w:tcW w:w="1134" w:type="dxa"/>
+          </w:tcPr>
+          <w:p>
+            <w:pPr>
+              <w:spacing w:after="0" w:line="240" w:lineRule="auto"/>
+              <w:jc w:val="center"/>
+              <w:rPr>
+                <w:rFonts w:ascii="Arial" w:eastAsia="黑体" w:hAnsi="Arial" w:cs="Arial"/>
+                <w:sz w:val="20"/>
+                <w:szCs w:val="20"/>
               </w:rPr>
             </w:pPr>
           </w:p>
@@ -390,47 +689,134 @@
       </w:tr>
       <w:tr>
         <w:trPr>
-          <w:trHeight w:val="191"/>
+          <w:trHeight w:val="136"/>
           <w:jc w:val="center"/>
         </w:trPr>
         <w:tc>
           <w:tcPr>
-            <w:tcW w:w="1843" w:type="dxa"/>
-          </w:tcPr>
-          <w:p>
-            <w:pPr>
-              <w:spacing w:after="0" w:line="240" w:lineRule="auto"/>
-              <w:jc w:val="right"/>
-              <w:rPr>
-                <w:rFonts w:ascii="Arial" w:eastAsia="黑体" w:hAnsi="Arial" w:cs="Arial"/>
-                <w:color w:val="538135" w:themeColor="accent6" w:themeShade="BF"/>
-                <w:sz w:val="20"/>
-                <w:szCs w:val="20"/>
-              </w:rPr>
-            </w:pPr>
-            <w:r>
-              <w:rPr>
-                <w:rFonts w:ascii="Arial" w:eastAsia="黑体" w:hAnsi="Arial" w:cs="Arial"/>
-                <w:color w:val="538135" w:themeColor="accent6" w:themeShade="BF"/>
-                <w:sz w:val="20"/>
-                <w:szCs w:val="20"/>
-              </w:rPr>
-              <w:t>(g/linear meter)</w:t>
-            </w:r>
-          </w:p>
-        </w:tc>
-        <w:tc>
-          <w:tcPr>
-            <w:tcW w:w="8647" w:type="dxa"/>
+            <w:tcW w:w="1985" w:type="dxa"/>
+          </w:tcPr>
+          <w:p>
+            <w:pPr>
+              <w:spacing w:after="0" w:line="240" w:lineRule="auto"/>
+              <w:jc w:val="center"/>
+              <w:rPr>
+                <w:rFonts w:ascii="Arial" w:eastAsia="黑体" w:hAnsi="Arial" w:cs="Arial"/>
+                <w:sz w:val="20"/>
+                <w:szCs w:val="20"/>
+              </w:rPr>
+            </w:pPr>
+          </w:p>
+        </w:tc>
+        <w:tc>
+          <w:tcPr>
+            <w:tcW w:w="992" w:type="dxa"/>
             <w:gridSpan w:val="2"/>
           </w:tcPr>
           <w:p>
             <w:pPr>
               <w:spacing w:after="0" w:line="240" w:lineRule="auto"/>
-              <w:rPr>
-                <w:rFonts w:ascii="Arial" w:eastAsia="黑体" w:hAnsi="Arial" w:cs="Arial"/>
-                <w:sz w:val="13"/>
-                <w:szCs w:val="13"/>
+              <w:jc w:val="center"/>
+              <w:rPr>
+                <w:rFonts w:ascii="Arial" w:eastAsia="黑体" w:hAnsi="Arial" w:cs="Arial"/>
+                <w:sz w:val="20"/>
+                <w:szCs w:val="20"/>
+              </w:rPr>
+            </w:pPr>
+          </w:p>
+        </w:tc>
+        <w:tc>
+          <w:tcPr>
+            <w:tcW w:w="992" w:type="dxa"/>
+          </w:tcPr>
+          <w:p>
+            <w:pPr>
+              <w:spacing w:after="0" w:line="240" w:lineRule="auto"/>
+              <w:jc w:val="center"/>
+              <w:rPr>
+                <w:rFonts w:ascii="Arial" w:eastAsia="黑体" w:hAnsi="Arial" w:cs="Arial"/>
+                <w:sz w:val="20"/>
+                <w:szCs w:val="20"/>
+              </w:rPr>
+            </w:pPr>
+          </w:p>
+        </w:tc>
+        <w:tc>
+          <w:tcPr>
+            <w:tcW w:w="992" w:type="dxa"/>
+          </w:tcPr>
+          <w:p>
+            <w:pPr>
+              <w:spacing w:after="0" w:line="240" w:lineRule="auto"/>
+              <w:jc w:val="center"/>
+              <w:rPr>
+                <w:rFonts w:ascii="Arial" w:eastAsia="黑体" w:hAnsi="Arial" w:cs="Arial"/>
+                <w:sz w:val="20"/>
+                <w:szCs w:val="20"/>
+              </w:rPr>
+            </w:pPr>
+          </w:p>
+        </w:tc>
+        <w:tc>
+          <w:tcPr>
+            <w:tcW w:w="993" w:type="dxa"/>
+          </w:tcPr>
+          <w:p>
+            <w:pPr>
+              <w:spacing w:after="0" w:line="240" w:lineRule="auto"/>
+              <w:jc w:val="center"/>
+              <w:rPr>
+                <w:rFonts w:ascii="Arial" w:eastAsia="黑体" w:hAnsi="Arial" w:cs="Arial"/>
+                <w:sz w:val="20"/>
+                <w:szCs w:val="20"/>
+              </w:rPr>
+            </w:pPr>
+          </w:p>
+        </w:tc>
+        <w:tc>
+          <w:tcPr>
+            <w:tcW w:w="2268" w:type="dxa"/>
+          </w:tcPr>
+          <w:p>
+            <w:pPr>
+              <w:spacing w:after="0" w:line="240" w:lineRule="auto"/>
+              <w:jc w:val="center"/>
+              <w:rPr>
+                <w:rFonts w:ascii="Arial" w:eastAsia="黑体" w:hAnsi="Arial" w:cs="Arial"/>
+                <w:sz w:val="20"/>
+                <w:szCs w:val="20"/>
+              </w:rPr>
+            </w:pPr>
+          </w:p>
+        </w:tc>
+        <w:tc>
+          <w:tcPr>
+            <w:tcW w:w="1134" w:type="dxa"/>
+          </w:tcPr>
+          <w:p>
+            <w:pPr>
+              <w:spacing w:after="0" w:line="240" w:lineRule="auto"/>
+              <w:jc w:val="center"/>
+              <w:rPr>
+                <w:rFonts w:ascii="Arial" w:eastAsia="黑体" w:hAnsi="Arial" w:cs="Arial"/>
+                <w:sz w:val="20"/>
+                <w:szCs w:val="20"/>
+              </w:rPr>
+            </w:pPr>
+          </w:p>
+        </w:tc>
+        <w:tc>
+          <w:tcPr>
+            <w:tcW w:w="1134" w:type="dxa"/>
+          </w:tcPr>
+          <w:p>
+            <w:pPr>
+              <w:spacing w:after="0" w:line="240" w:lineRule="auto"/>
+              <w:jc w:val="center"/>
+              <w:rPr>
+                <w:rFonts w:ascii="Arial" w:eastAsia="黑体" w:hAnsi="Arial" w:cs="Arial"/>
+                <w:sz w:val="20"/>
+                <w:szCs w:val="20"/>
               </w:rPr>
             </w:pPr>
           </w:p>
@@ -438,67 +824,134 @@
       </w:tr>
       <w:tr>
         <w:trPr>
-          <w:trHeight w:val="191"/>
+          <w:trHeight w:val="136"/>
           <w:jc w:val="center"/>
         </w:trPr>
         <w:tc>
           <w:tcPr>
-            <w:tcW w:w="1843" w:type="dxa"/>
-          </w:tcPr>
-          <w:p>
-            <w:pPr>
-              <w:spacing w:after="0" w:line="240" w:lineRule="auto"/>
-              <w:jc w:val="right"/>
-              <w:rPr>
-                <w:rFonts w:ascii="Arial" w:eastAsia="黑体" w:hAnsi="Arial" w:cs="Arial"/>
-                <w:color w:val="538135" w:themeColor="accent6" w:themeShade="BF"/>
-                <w:sz w:val="20"/>
-                <w:szCs w:val="20"/>
-              </w:rPr>
-            </w:pPr>
-            <w:r>
-              <w:rPr>
-                <w:rFonts w:ascii="Arial" w:eastAsia="黑体" w:hAnsi="Arial" w:cs="Arial" w:hint="eastAsia"/>
-                <w:color w:val="538135" w:themeColor="accent6" w:themeShade="BF"/>
-                <w:sz w:val="20"/>
-                <w:szCs w:val="20"/>
-              </w:rPr>
-              <w:t xml:space="preserve">(g/piece </w:t>
-            </w:r>
-            <w:proofErr w:type="spellStart"/>
-            <w:r>
-              <w:rPr>
-                <w:rFonts w:ascii="Arial" w:eastAsia="黑体" w:hAnsi="Arial" w:cs="Arial" w:hint="eastAsia"/>
-                <w:color w:val="538135" w:themeColor="accent6" w:themeShade="BF"/>
-                <w:sz w:val="20"/>
-                <w:szCs w:val="20"/>
-              </w:rPr>
-              <w:t>lb</w:t>
-            </w:r>
-            <w:proofErr w:type="spellEnd"/>
-            <w:r>
-              <w:rPr>
-                <w:rFonts w:ascii="Arial" w:eastAsia="黑体" w:hAnsi="Arial" w:cs="Arial" w:hint="eastAsia"/>
-                <w:color w:val="538135" w:themeColor="accent6" w:themeShade="BF"/>
-                <w:sz w:val="20"/>
-                <w:szCs w:val="20"/>
-              </w:rPr>
-              <w:t>/dozen)</w:t>
-            </w:r>
-          </w:p>
-        </w:tc>
-        <w:tc>
-          <w:tcPr>
-            <w:tcW w:w="8647" w:type="dxa"/>
+            <w:tcW w:w="1985" w:type="dxa"/>
+          </w:tcPr>
+          <w:p>
+            <w:pPr>
+              <w:spacing w:after="0" w:line="240" w:lineRule="auto"/>
+              <w:jc w:val="center"/>
+              <w:rPr>
+                <w:rFonts w:ascii="Arial" w:eastAsia="黑体" w:hAnsi="Arial" w:cs="Arial"/>
+                <w:sz w:val="20"/>
+                <w:szCs w:val="20"/>
+              </w:rPr>
+            </w:pPr>
+          </w:p>
+        </w:tc>
+        <w:tc>
+          <w:tcPr>
+            <w:tcW w:w="992" w:type="dxa"/>
             <w:gridSpan w:val="2"/>
           </w:tcPr>
           <w:p>
             <w:pPr>
               <w:spacing w:after="0" w:line="240" w:lineRule="auto"/>
-              <w:rPr>
-                <w:rFonts w:ascii="Arial" w:eastAsia="黑体" w:hAnsi="Arial" w:cs="Arial"/>
-                <w:sz w:val="13"/>
-                <w:szCs w:val="13"/>
+              <w:jc w:val="center"/>
+              <w:rPr>
+                <w:rFonts w:ascii="Arial" w:eastAsia="黑体" w:hAnsi="Arial" w:cs="Arial"/>
+                <w:sz w:val="20"/>
+                <w:szCs w:val="20"/>
+              </w:rPr>
+            </w:pPr>
+          </w:p>
+        </w:tc>
+        <w:tc>
+          <w:tcPr>
+            <w:tcW w:w="992" w:type="dxa"/>
+          </w:tcPr>
+          <w:p>
+            <w:pPr>
+              <w:spacing w:after="0" w:line="240" w:lineRule="auto"/>
+              <w:jc w:val="center"/>
+              <w:rPr>
+                <w:rFonts w:ascii="Arial" w:eastAsia="黑体" w:hAnsi="Arial" w:cs="Arial"/>
+                <w:sz w:val="20"/>
+                <w:szCs w:val="20"/>
+              </w:rPr>
+            </w:pPr>
+          </w:p>
+        </w:tc>
+        <w:tc>
+          <w:tcPr>
+            <w:tcW w:w="992" w:type="dxa"/>
+          </w:tcPr>
+          <w:p>
+            <w:pPr>
+              <w:spacing w:after="0" w:line="240" w:lineRule="auto"/>
+              <w:jc w:val="center"/>
+              <w:rPr>
+                <w:rFonts w:ascii="Arial" w:eastAsia="黑体" w:hAnsi="Arial" w:cs="Arial"/>
+                <w:sz w:val="20"/>
+                <w:szCs w:val="20"/>
+              </w:rPr>
+            </w:pPr>
+          </w:p>
+        </w:tc>
+        <w:tc>
+          <w:tcPr>
+            <w:tcW w:w="993" w:type="dxa"/>
+          </w:tcPr>
+          <w:p>
+            <w:pPr>
+              <w:spacing w:after="0" w:line="240" w:lineRule="auto"/>
+              <w:jc w:val="center"/>
+              <w:rPr>
+                <w:rFonts w:ascii="Arial" w:eastAsia="黑体" w:hAnsi="Arial" w:cs="Arial"/>
+                <w:sz w:val="20"/>
+                <w:szCs w:val="20"/>
+              </w:rPr>
+            </w:pPr>
+          </w:p>
+        </w:tc>
+        <w:tc>
+          <w:tcPr>
+            <w:tcW w:w="2268" w:type="dxa"/>
+          </w:tcPr>
+          <w:p>
+            <w:pPr>
+              <w:spacing w:after="0" w:line="240" w:lineRule="auto"/>
+              <w:jc w:val="center"/>
+              <w:rPr>
+                <w:rFonts w:ascii="Arial" w:eastAsia="黑体" w:hAnsi="Arial" w:cs="Arial"/>
+                <w:sz w:val="20"/>
+                <w:szCs w:val="20"/>
+              </w:rPr>
+            </w:pPr>
+          </w:p>
+        </w:tc>
+        <w:tc>
+          <w:tcPr>
+            <w:tcW w:w="1134" w:type="dxa"/>
+          </w:tcPr>
+          <w:p>
+            <w:pPr>
+              <w:spacing w:after="0" w:line="240" w:lineRule="auto"/>
+              <w:jc w:val="center"/>
+              <w:rPr>
+                <w:rFonts w:ascii="Arial" w:eastAsia="黑体" w:hAnsi="Arial" w:cs="Arial"/>
+                <w:sz w:val="20"/>
+                <w:szCs w:val="20"/>
+              </w:rPr>
+            </w:pPr>
+          </w:p>
+        </w:tc>
+        <w:tc>
+          <w:tcPr>
+            <w:tcW w:w="1134" w:type="dxa"/>
+          </w:tcPr>
+          <w:p>
+            <w:pPr>
+              <w:spacing w:after="0" w:line="240" w:lineRule="auto"/>
+              <w:jc w:val="center"/>
+              <w:rPr>
+                <w:rFonts w:ascii="Arial" w:eastAsia="黑体" w:hAnsi="Arial" w:cs="Arial"/>
+                <w:sz w:val="20"/>
+                <w:szCs w:val="20"/>
               </w:rPr>
             </w:pPr>
           </w:p>
@@ -506,36 +959,134 @@
       </w:tr>
       <w:tr>
         <w:trPr>
-          <w:trHeight w:val="191"/>
+          <w:trHeight w:val="136"/>
           <w:jc w:val="center"/>
         </w:trPr>
         <w:tc>
           <w:tcPr>
-            <w:tcW w:w="1843" w:type="dxa"/>
-          </w:tcPr>
-          <w:p>
-            <w:pPr>
-              <w:spacing w:after="0" w:line="240" w:lineRule="auto"/>
-              <w:rPr>
-                <w:rFonts w:ascii="Arial" w:eastAsia="黑体" w:hAnsi="Arial" w:cs="Arial"/>
-                <w:sz w:val="13"/>
-                <w:szCs w:val="13"/>
-              </w:rPr>
-            </w:pPr>
-          </w:p>
-        </w:tc>
-        <w:tc>
-          <w:tcPr>
-            <w:tcW w:w="8647" w:type="dxa"/>
+            <w:tcW w:w="1985" w:type="dxa"/>
+          </w:tcPr>
+          <w:p>
+            <w:pPr>
+              <w:spacing w:after="0" w:line="240" w:lineRule="auto"/>
+              <w:jc w:val="center"/>
+              <w:rPr>
+                <w:rFonts w:ascii="Arial" w:eastAsia="黑体" w:hAnsi="Arial" w:cs="Arial"/>
+                <w:sz w:val="20"/>
+                <w:szCs w:val="20"/>
+              </w:rPr>
+            </w:pPr>
+          </w:p>
+        </w:tc>
+        <w:tc>
+          <w:tcPr>
+            <w:tcW w:w="992" w:type="dxa"/>
             <w:gridSpan w:val="2"/>
           </w:tcPr>
           <w:p>
             <w:pPr>
               <w:spacing w:after="0" w:line="240" w:lineRule="auto"/>
-              <w:rPr>
-                <w:rFonts w:ascii="Arial" w:eastAsia="黑体" w:hAnsi="Arial" w:cs="Arial"/>
-                <w:sz w:val="13"/>
-                <w:szCs w:val="13"/>
+              <w:jc w:val="center"/>
+              <w:rPr>
+                <w:rFonts w:ascii="Arial" w:eastAsia="黑体" w:hAnsi="Arial" w:cs="Arial"/>
+                <w:sz w:val="20"/>
+                <w:szCs w:val="20"/>
+              </w:rPr>
+            </w:pPr>
+          </w:p>
+        </w:tc>
+        <w:tc>
+          <w:tcPr>
+            <w:tcW w:w="992" w:type="dxa"/>
+          </w:tcPr>
+          <w:p>
+            <w:pPr>
+              <w:spacing w:after="0" w:line="240" w:lineRule="auto"/>
+              <w:jc w:val="center"/>
+              <w:rPr>
+                <w:rFonts w:ascii="Arial" w:eastAsia="黑体" w:hAnsi="Arial" w:cs="Arial"/>
+                <w:sz w:val="20"/>
+                <w:szCs w:val="20"/>
+              </w:rPr>
+            </w:pPr>
+          </w:p>
+        </w:tc>
+        <w:tc>
+          <w:tcPr>
+            <w:tcW w:w="992" w:type="dxa"/>
+          </w:tcPr>
+          <w:p>
+            <w:pPr>
+              <w:spacing w:after="0" w:line="240" w:lineRule="auto"/>
+              <w:jc w:val="center"/>
+              <w:rPr>
+                <w:rFonts w:ascii="Arial" w:eastAsia="黑体" w:hAnsi="Arial" w:cs="Arial"/>
+                <w:sz w:val="20"/>
+                <w:szCs w:val="20"/>
+              </w:rPr>
+            </w:pPr>
+          </w:p>
+        </w:tc>
+        <w:tc>
+          <w:tcPr>
+            <w:tcW w:w="993" w:type="dxa"/>
+          </w:tcPr>
+          <w:p>
+            <w:pPr>
+              <w:spacing w:after="0" w:line="240" w:lineRule="auto"/>
+              <w:jc w:val="center"/>
+              <w:rPr>
+                <w:rFonts w:ascii="Arial" w:eastAsia="黑体" w:hAnsi="Arial" w:cs="Arial"/>
+                <w:sz w:val="20"/>
+                <w:szCs w:val="20"/>
+              </w:rPr>
+            </w:pPr>
+          </w:p>
+        </w:tc>
+        <w:tc>
+          <w:tcPr>
+            <w:tcW w:w="2268" w:type="dxa"/>
+          </w:tcPr>
+          <w:p>
+            <w:pPr>
+              <w:spacing w:after="0" w:line="240" w:lineRule="auto"/>
+              <w:jc w:val="center"/>
+              <w:rPr>
+                <w:rFonts w:ascii="Arial" w:eastAsia="黑体" w:hAnsi="Arial" w:cs="Arial"/>
+                <w:sz w:val="20"/>
+                <w:szCs w:val="20"/>
+              </w:rPr>
+            </w:pPr>
+          </w:p>
+        </w:tc>
+        <w:tc>
+          <w:tcPr>
+            <w:tcW w:w="1134" w:type="dxa"/>
+          </w:tcPr>
+          <w:p>
+            <w:pPr>
+              <w:spacing w:after="0" w:line="240" w:lineRule="auto"/>
+              <w:jc w:val="center"/>
+              <w:rPr>
+                <w:rFonts w:ascii="Arial" w:eastAsia="黑体" w:hAnsi="Arial" w:cs="Arial"/>
+                <w:sz w:val="20"/>
+                <w:szCs w:val="20"/>
+              </w:rPr>
+            </w:pPr>
+          </w:p>
+        </w:tc>
+        <w:tc>
+          <w:tcPr>
+            <w:tcW w:w="1134" w:type="dxa"/>
+          </w:tcPr>
+          <w:p>
+            <w:pPr>
+              <w:spacing w:after="0" w:line="240" w:lineRule="auto"/>
+              <w:jc w:val="center"/>
+              <w:rPr>
+                <w:rFonts w:ascii="Arial" w:eastAsia="黑体" w:hAnsi="Arial" w:cs="Arial"/>
+                <w:sz w:val="20"/>
+                <w:szCs w:val="20"/>
               </w:rPr>
             </w:pPr>
           </w:p>
@@ -543,36 +1094,269 @@
       </w:tr>
       <w:tr>
         <w:trPr>
-          <w:trHeight w:val="191"/>
+          <w:trHeight w:val="136"/>
           <w:jc w:val="center"/>
         </w:trPr>
         <w:tc>
           <w:tcPr>
-            <w:tcW w:w="1843" w:type="dxa"/>
-          </w:tcPr>
-          <w:p>
-            <w:pPr>
-              <w:spacing w:after="0" w:line="240" w:lineRule="auto"/>
-              <w:rPr>
-                <w:rFonts w:ascii="Arial" w:eastAsia="黑体" w:hAnsi="Arial" w:cs="Arial"/>
-                <w:sz w:val="13"/>
-                <w:szCs w:val="13"/>
-              </w:rPr>
-            </w:pPr>
-          </w:p>
-        </w:tc>
-        <w:tc>
-          <w:tcPr>
-            <w:tcW w:w="8647" w:type="dxa"/>
+            <w:tcW w:w="1985" w:type="dxa"/>
+          </w:tcPr>
+          <w:p>
+            <w:pPr>
+              <w:spacing w:after="0" w:line="240" w:lineRule="auto"/>
+              <w:jc w:val="center"/>
+              <w:rPr>
+                <w:rFonts w:ascii="Arial" w:eastAsia="黑体" w:hAnsi="Arial" w:cs="Arial"/>
+                <w:sz w:val="20"/>
+                <w:szCs w:val="20"/>
+              </w:rPr>
+            </w:pPr>
+          </w:p>
+        </w:tc>
+        <w:tc>
+          <w:tcPr>
+            <w:tcW w:w="992" w:type="dxa"/>
             <w:gridSpan w:val="2"/>
           </w:tcPr>
           <w:p>
             <w:pPr>
               <w:spacing w:after="0" w:line="240" w:lineRule="auto"/>
-              <w:rPr>
-                <w:rFonts w:ascii="Arial" w:eastAsia="黑体" w:hAnsi="Arial" w:cs="Arial"/>
-                <w:sz w:val="13"/>
-                <w:szCs w:val="13"/>
+              <w:jc w:val="center"/>
+              <w:rPr>
+                <w:rFonts w:ascii="Arial" w:eastAsia="黑体" w:hAnsi="Arial" w:cs="Arial"/>
+                <w:sz w:val="20"/>
+                <w:szCs w:val="20"/>
+              </w:rPr>
+            </w:pPr>
+          </w:p>
+        </w:tc>
+        <w:tc>
+          <w:tcPr>
+            <w:tcW w:w="992" w:type="dxa"/>
+          </w:tcPr>
+          <w:p>
+            <w:pPr>
+              <w:spacing w:after="0" w:line="240" w:lineRule="auto"/>
+              <w:jc w:val="center"/>
+              <w:rPr>
+                <w:rFonts w:ascii="Arial" w:eastAsia="黑体" w:hAnsi="Arial" w:cs="Arial"/>
+                <w:sz w:val="20"/>
+                <w:szCs w:val="20"/>
+              </w:rPr>
+            </w:pPr>
+          </w:p>
+        </w:tc>
+        <w:tc>
+          <w:tcPr>
+            <w:tcW w:w="992" w:type="dxa"/>
+          </w:tcPr>
+          <w:p>
+            <w:pPr>
+              <w:spacing w:after="0" w:line="240" w:lineRule="auto"/>
+              <w:jc w:val="center"/>
+              <w:rPr>
+                <w:rFonts w:ascii="Arial" w:eastAsia="黑体" w:hAnsi="Arial" w:cs="Arial"/>
+                <w:sz w:val="20"/>
+                <w:szCs w:val="20"/>
+              </w:rPr>
+            </w:pPr>
+          </w:p>
+        </w:tc>
+        <w:tc>
+          <w:tcPr>
+            <w:tcW w:w="993" w:type="dxa"/>
+          </w:tcPr>
+          <w:p>
+            <w:pPr>
+              <w:spacing w:after="0" w:line="240" w:lineRule="auto"/>
+              <w:jc w:val="center"/>
+              <w:rPr>
+                <w:rFonts w:ascii="Arial" w:eastAsia="黑体" w:hAnsi="Arial" w:cs="Arial"/>
+                <w:sz w:val="20"/>
+                <w:szCs w:val="20"/>
+              </w:rPr>
+            </w:pPr>
+          </w:p>
+        </w:tc>
+        <w:tc>
+          <w:tcPr>
+            <w:tcW w:w="2268" w:type="dxa"/>
+          </w:tcPr>
+          <w:p>
+            <w:pPr>
+              <w:spacing w:after="0" w:line="240" w:lineRule="auto"/>
+              <w:jc w:val="center"/>
+              <w:rPr>
+                <w:rFonts w:ascii="Arial" w:eastAsia="黑体" w:hAnsi="Arial" w:cs="Arial"/>
+                <w:sz w:val="20"/>
+                <w:szCs w:val="20"/>
+              </w:rPr>
+            </w:pPr>
+          </w:p>
+        </w:tc>
+        <w:tc>
+          <w:tcPr>
+            <w:tcW w:w="1134" w:type="dxa"/>
+          </w:tcPr>
+          <w:p>
+            <w:pPr>
+              <w:spacing w:after="0" w:line="240" w:lineRule="auto"/>
+              <w:jc w:val="center"/>
+              <w:rPr>
+                <w:rFonts w:ascii="Arial" w:eastAsia="黑体" w:hAnsi="Arial" w:cs="Arial"/>
+                <w:sz w:val="20"/>
+                <w:szCs w:val="20"/>
+              </w:rPr>
+            </w:pPr>
+          </w:p>
+        </w:tc>
+        <w:tc>
+          <w:tcPr>
+            <w:tcW w:w="1134" w:type="dxa"/>
+          </w:tcPr>
+          <w:p>
+            <w:pPr>
+              <w:spacing w:after="0" w:line="240" w:lineRule="auto"/>
+              <w:jc w:val="center"/>
+              <w:rPr>
+                <w:rFonts w:ascii="Arial" w:eastAsia="黑体" w:hAnsi="Arial" w:cs="Arial"/>
+                <w:sz w:val="20"/>
+                <w:szCs w:val="20"/>
+              </w:rPr>
+            </w:pPr>
+          </w:p>
+        </w:tc>
+      </w:tr>
+      <w:tr>
+        <w:trPr>
+          <w:trHeight w:val="136"/>
+          <w:jc w:val="center"/>
+        </w:trPr>
+        <w:tc>
+          <w:tcPr>
+            <w:tcW w:w="1985" w:type="dxa"/>
+          </w:tcPr>
+          <w:p>
+            <w:pPr>
+              <w:spacing w:after="0" w:line="240" w:lineRule="auto"/>
+              <w:jc w:val="center"/>
+              <w:rPr>
+                <w:rFonts w:ascii="Arial" w:eastAsia="黑体" w:hAnsi="Arial" w:cs="Arial"/>
+                <w:sz w:val="20"/>
+                <w:szCs w:val="20"/>
+              </w:rPr>
+            </w:pPr>
+          </w:p>
+        </w:tc>
+        <w:tc>
+          <w:tcPr>
+            <w:tcW w:w="992" w:type="dxa"/>
+            <w:gridSpan w:val="2"/>
+          </w:tcPr>
+          <w:p>
+            <w:pPr>
+              <w:spacing w:after="0" w:line="240" w:lineRule="auto"/>
+              <w:jc w:val="center"/>
+              <w:rPr>
+                <w:rFonts w:ascii="Arial" w:eastAsia="黑体" w:hAnsi="Arial" w:cs="Arial"/>
+                <w:sz w:val="20"/>
+                <w:szCs w:val="20"/>
+              </w:rPr>
+            </w:pPr>
+          </w:p>
+        </w:tc>
+        <w:tc>
+          <w:tcPr>
+            <w:tcW w:w="992" w:type="dxa"/>
+          </w:tcPr>
+          <w:p>
+            <w:pPr>
+              <w:spacing w:after="0" w:line="240" w:lineRule="auto"/>
+              <w:jc w:val="center"/>
+              <w:rPr>
+                <w:rFonts w:ascii="Arial" w:eastAsia="黑体" w:hAnsi="Arial" w:cs="Arial"/>
+                <w:sz w:val="20"/>
+                <w:szCs w:val="20"/>
+              </w:rPr>
+            </w:pPr>
+          </w:p>
+        </w:tc>
+        <w:tc>
+          <w:tcPr>
+            <w:tcW w:w="992" w:type="dxa"/>
+          </w:tcPr>
+          <w:p>
+            <w:pPr>
+              <w:spacing w:after="0" w:line="240" w:lineRule="auto"/>
+              <w:jc w:val="center"/>
+              <w:rPr>
+                <w:rFonts w:ascii="Arial" w:eastAsia="黑体" w:hAnsi="Arial" w:cs="Arial"/>
+                <w:sz w:val="20"/>
+                <w:szCs w:val="20"/>
+              </w:rPr>
+            </w:pPr>
+          </w:p>
+        </w:tc>
+        <w:tc>
+          <w:tcPr>
+            <w:tcW w:w="993" w:type="dxa"/>
+          </w:tcPr>
+          <w:p>
+            <w:pPr>
+              <w:spacing w:after="0" w:line="240" w:lineRule="auto"/>
+              <w:jc w:val="center"/>
+              <w:rPr>
+                <w:rFonts w:ascii="Arial" w:eastAsia="黑体" w:hAnsi="Arial" w:cs="Arial"/>
+                <w:sz w:val="20"/>
+                <w:szCs w:val="20"/>
+              </w:rPr>
+            </w:pPr>
+          </w:p>
+        </w:tc>
+        <w:tc>
+          <w:tcPr>
+            <w:tcW w:w="2268" w:type="dxa"/>
+          </w:tcPr>
+          <w:p>
+            <w:pPr>
+              <w:spacing w:after="0" w:line="240" w:lineRule="auto"/>
+              <w:jc w:val="center"/>
+              <w:rPr>
+                <w:rFonts w:ascii="Arial" w:eastAsia="黑体" w:hAnsi="Arial" w:cs="Arial"/>
+                <w:sz w:val="20"/>
+                <w:szCs w:val="20"/>
+              </w:rPr>
+            </w:pPr>
+          </w:p>
+        </w:tc>
+        <w:tc>
+          <w:tcPr>
+            <w:tcW w:w="1134" w:type="dxa"/>
+          </w:tcPr>
+          <w:p>
+            <w:pPr>
+              <w:spacing w:after="0" w:line="240" w:lineRule="auto"/>
+              <w:jc w:val="center"/>
+              <w:rPr>
+                <w:rFonts w:ascii="Arial" w:eastAsia="黑体" w:hAnsi="Arial" w:cs="Arial"/>
+                <w:sz w:val="20"/>
+                <w:szCs w:val="20"/>
+              </w:rPr>
+            </w:pPr>
+          </w:p>
+        </w:tc>
+        <w:tc>
+          <w:tcPr>
+            <w:tcW w:w="1134" w:type="dxa"/>
+          </w:tcPr>
+          <w:p>
+            <w:pPr>
+              <w:spacing w:after="0" w:line="240" w:lineRule="auto"/>
+              <w:jc w:val="center"/>
+              <w:rPr>
+                <w:rFonts w:ascii="Arial" w:eastAsia="黑体" w:hAnsi="Arial" w:cs="Arial"/>
+                <w:sz w:val="20"/>
+                <w:szCs w:val="20"/>
               </w:rPr>
             </w:pPr>
           </w:p>
@@ -588,8 +1372,6 @@
           <w:szCs w:val="18"/>
         </w:rPr>
       </w:pPr>
-      <w:bookmarkStart w:id="15" w:name="Description6"/>
-      <w:bookmarkEnd w:id="15"/>
     </w:p>
     <w:p>
       <w:pPr>
@@ -646,7 +1428,34 @@
                 <w:sz w:val="20"/>
                 <w:szCs w:val="20"/>
               </w:rPr>
-              <w:t>1oz/yd2 =33.91g/m2</w:t>
+              <w:t>1oz/yd</w:t>
+            </w:r>
+            <w:r>
+              <w:rPr>
+                <w:rFonts w:eastAsia="黑体" w:cs="Calibri" w:hint="eastAsia"/>
+                <w:color w:val="538135" w:themeColor="accent6" w:themeShade="BF"/>
+                <w:sz w:val="20"/>
+                <w:szCs w:val="20"/>
+              </w:rPr>
+              <w:t>²</w:t>
+            </w:r>
+            <w:r>
+              <w:rPr>
+                <w:rFonts w:ascii="Arial" w:eastAsia="黑体" w:hAnsi="Arial" w:cs="Arial"/>
+                <w:color w:val="538135" w:themeColor="accent6" w:themeShade="BF"/>
+                <w:sz w:val="20"/>
+                <w:szCs w:val="20"/>
+              </w:rPr>
+              <w:t xml:space="preserve"> =33.91g/m</w:t>
+            </w:r>
+            <w:r>
+              <w:rPr>
+                <w:rFonts w:eastAsia="黑体" w:cs="Calibri" w:hint="eastAsia"/>
+                <w:color w:val="538135" w:themeColor="accent6" w:themeShade="BF"/>
+                <w:sz w:val="20"/>
+                <w:szCs w:val="20"/>
+              </w:rPr>
+              <w:t>²</w:t>
             </w:r>
           </w:p>
         </w:tc>
@@ -674,7 +1483,34 @@
                 <w:sz w:val="20"/>
                 <w:szCs w:val="20"/>
               </w:rPr>
-              <w:t>1g/m2 = 0.029493oz/yd2</w:t>
+              <w:t>1g/m</w:t>
+            </w:r>
+            <w:r>
+              <w:rPr>
+                <w:rFonts w:eastAsia="黑体" w:cs="Calibri" w:hint="eastAsia"/>
+                <w:color w:val="538135" w:themeColor="accent6" w:themeShade="BF"/>
+                <w:sz w:val="20"/>
+                <w:szCs w:val="20"/>
+              </w:rPr>
+              <w:t>²</w:t>
+            </w:r>
+            <w:r>
+              <w:rPr>
+                <w:rFonts w:ascii="Arial" w:eastAsia="黑体" w:hAnsi="Arial" w:cs="Arial"/>
+                <w:color w:val="538135" w:themeColor="accent6" w:themeShade="BF"/>
+                <w:sz w:val="20"/>
+                <w:szCs w:val="20"/>
+              </w:rPr>
+              <w:t xml:space="preserve"> = 0.029493oz/yd</w:t>
+            </w:r>
+            <w:r>
+              <w:rPr>
+                <w:rFonts w:eastAsia="黑体" w:cs="Calibri" w:hint="eastAsia"/>
+                <w:color w:val="538135" w:themeColor="accent6" w:themeShade="BF"/>
+                <w:sz w:val="20"/>
+                <w:szCs w:val="20"/>
+              </w:rPr>
+              <w:t>²</w:t>
             </w:r>
           </w:p>
         </w:tc>
@@ -736,7 +1572,7 @@
               <w:rPr>
                 <w:rFonts w:ascii="Arial" w:hAnsi="Arial" w:cs="Arial"/>
               </w:rPr>
-              <w:t>Specimen(g/dm2)</w:t>
+              <w:t>Specimen</w:t>
             </w:r>
           </w:p>
         </w:tc>
@@ -747,7 +1583,6 @@
             <w:tcBorders>
               <w:top w:val="single" w:sz="4" w:space="0" w:color="auto"/>
               <w:left w:val="single" w:sz="4" w:space="0" w:color="auto"/>
-              <w:bottom w:val="single" w:sz="4" w:space="0" w:color="auto"/>
               <w:right w:val="single" w:sz="4" w:space="0" w:color="auto"/>
             </w:tcBorders>
             <w:vAlign w:val="center"/>
@@ -765,21 +1600,6 @@
                 <w:rFonts w:ascii="Arial" w:hAnsi="Arial" w:cs="Arial"/>
               </w:rPr>
               <w:t>Average</w:t>
-            </w:r>
-          </w:p>
-          <w:p>
-            <w:pPr>
-              <w:spacing w:after="0" w:line="240" w:lineRule="auto"/>
-              <w:jc w:val="center"/>
-              <w:rPr>
-                <w:rFonts w:ascii="Arial" w:hAnsi="Arial" w:cs="Arial"/>
-              </w:rPr>
-            </w:pPr>
-            <w:r>
-              <w:rPr>
-                <w:rFonts w:ascii="Arial" w:hAnsi="Arial" w:cs="Arial"/>
-              </w:rPr>
-              <w:t>(g/dm2)</w:t>
             </w:r>
           </w:p>
         </w:tc>
@@ -946,7 +1766,6 @@
             <w:tcW w:w="2410" w:type="dxa"/>
             <w:vMerge/>
             <w:tcBorders>
-              <w:top w:val="single" w:sz="4" w:space="0" w:color="auto"/>
               <w:left w:val="single" w:sz="4" w:space="0" w:color="auto"/>
               <w:bottom w:val="single" w:sz="4" w:space="0" w:color="auto"/>
               <w:right w:val="single" w:sz="4" w:space="0" w:color="auto"/>
@@ -955,9 +1774,8 @@
           <w:p>
             <w:pPr>
               <w:spacing w:after="0" w:line="240" w:lineRule="auto"/>
-              <w:jc w:val="center"/>
-              <w:rPr>
-                <w:rFonts w:ascii="Arial" w:hAnsi="Arial" w:cs="Arial"/>
+              <w:rPr>
+                <w:rFonts w:ascii="Arial" w:hAnsi="Arial" w:cs="Arial" w:hint="eastAsia"/>
               </w:rPr>
             </w:pPr>
           </w:p>
@@ -2185,7 +3003,6 @@
           <w:szCs w:val="20"/>
         </w:rPr>
       </w:pPr>
-      <w:proofErr w:type="gramStart"/>
       <w:r>
         <w:rPr>
           <w:rFonts w:ascii="Arial" w:hAnsi="Arial" w:cs="Arial"/>
@@ -2193,9 +3010,17 @@
           <w:sz w:val="20"/>
           <w:szCs w:val="20"/>
         </w:rPr>
-        <w:t>#:The</w:t>
+        <w:t>#:</w:t>
       </w:r>
-      <w:proofErr w:type="gramEnd"/>
+      <w:r>
+        <w:rPr>
+          <w:rFonts w:ascii="Arial" w:hAnsi="Arial" w:cs="Arial" w:hint="eastAsia"/>
+          <w:color w:val="000000" w:themeColor="text1"/>
+          <w:sz w:val="20"/>
+          <w:szCs w:val="20"/>
+        </w:rPr>
+        <w:t xml:space="preserve"> </w:t>
+      </w:r>
       <w:r>
         <w:rPr>
           <w:rFonts w:ascii="Arial" w:hAnsi="Arial" w:cs="Arial"/>
@@ -2203,9 +3028,17 @@
           <w:sz w:val="20"/>
           <w:szCs w:val="20"/>
         </w:rPr>
-        <w:t xml:space="preserve"> </w:t>
+        <w:t>The result for ref</w:t>
       </w:r>
-      <w:proofErr w:type="gramStart"/>
+      <w:r>
+        <w:rPr>
+          <w:rFonts w:ascii="Arial" w:hAnsi="Arial" w:cs="Arial" w:hint="eastAsia"/>
+          <w:color w:val="000000" w:themeColor="text1"/>
+          <w:sz w:val="20"/>
+          <w:szCs w:val="20"/>
+        </w:rPr>
+        <w:t>e</w:t>
+      </w:r>
       <w:r>
         <w:rPr>
           <w:rFonts w:ascii="Arial" w:hAnsi="Arial" w:cs="Arial"/>
@@ -2213,37 +3046,7 @@
           <w:sz w:val="20"/>
           <w:szCs w:val="20"/>
         </w:rPr>
-        <w:t>result  for</w:t>
-      </w:r>
-      <w:proofErr w:type="gramEnd"/>
-      <w:r>
-        <w:rPr>
-          <w:rFonts w:ascii="Arial" w:hAnsi="Arial" w:cs="Arial"/>
-          <w:color w:val="000000" w:themeColor="text1"/>
-          <w:sz w:val="20"/>
-          <w:szCs w:val="20"/>
-        </w:rPr>
-        <w:t xml:space="preserve"> </w:t>
-      </w:r>
-      <w:proofErr w:type="spellStart"/>
-      <w:r>
-        <w:rPr>
-          <w:rFonts w:ascii="Arial" w:hAnsi="Arial" w:cs="Arial"/>
-          <w:color w:val="000000" w:themeColor="text1"/>
-          <w:sz w:val="20"/>
-          <w:szCs w:val="20"/>
-        </w:rPr>
-        <w:t>reforence</w:t>
-      </w:r>
-      <w:proofErr w:type="spellEnd"/>
-      <w:r>
-        <w:rPr>
-          <w:rFonts w:ascii="Arial" w:hAnsi="Arial" w:cs="Arial"/>
-          <w:color w:val="000000" w:themeColor="text1"/>
-          <w:sz w:val="20"/>
-          <w:szCs w:val="20"/>
-        </w:rPr>
-        <w:t xml:space="preserve"> only.</w:t>
+        <w:t>rence only.</w:t>
       </w:r>
     </w:p>
     <w:sectPr>
@@ -2380,13 +3183,63 @@
           </w:pPr>
           <w:r>
             <w:rPr>
+              <w:rFonts w:ascii="Arial" w:eastAsia="黑体" w:hAnsi="Arial" w:cs="Arial" w:hint="eastAsia"/>
+              <w:bCs/>
+              <w:sz w:val="14"/>
+              <w:szCs w:val="14"/>
+              <w:lang w:val="de-CH"/>
+            </w:rPr>
+            <w:t>Conducted</w:t>
+          </w:r>
+          <w:r>
+            <w:rPr>
               <w:rFonts w:ascii="Arial" w:eastAsia="黑体" w:hAnsi="Arial" w:cs="Arial"/>
               <w:bCs/>
               <w:sz w:val="14"/>
               <w:szCs w:val="14"/>
               <w:lang w:val="de-CH"/>
             </w:rPr>
-            <w:t>Prepared by:______________________</w:t>
+            <w:t xml:space="preserve"> by</w:t>
+          </w:r>
+          <w:r>
+            <w:rPr>
+              <w:rFonts w:ascii="Arial" w:eastAsia="黑体" w:hAnsi="Arial" w:cs="Arial" w:hint="eastAsia"/>
+              <w:bCs/>
+              <w:sz w:val="14"/>
+              <w:szCs w:val="14"/>
+              <w:lang w:val="de-CH"/>
+            </w:rPr>
+            <w:t xml:space="preserve"> / Date</w:t>
+          </w:r>
+          <w:r>
+            <w:rPr>
+              <w:rFonts w:ascii="Arial" w:eastAsia="黑体" w:hAnsi="Arial" w:cs="Arial"/>
+              <w:bCs/>
+              <w:sz w:val="14"/>
+              <w:szCs w:val="14"/>
+              <w:lang w:val="de-CH"/>
+            </w:rPr>
+            <w:t>:___________</w:t>
+          </w:r>
+          <w:r>
+            <w:rPr>
+              <w:rFonts w:ascii="Arial" w:eastAsia="黑体" w:hAnsi="Arial" w:cs="Arial" w:hint="eastAsia"/>
+              <w:bCs/>
+              <w:sz w:val="14"/>
+              <w:szCs w:val="14"/>
+              <w:lang w:val="de-CH"/>
+            </w:rPr>
+            <w:t>__</w:t>
+          </w:r>
+          <w:r>
+            <w:rPr>
+              <w:rFonts w:ascii="Arial" w:eastAsia="黑体" w:hAnsi="Arial" w:cs="Arial"/>
+              <w:bCs/>
+              <w:sz w:val="14"/>
+              <w:szCs w:val="14"/>
+              <w:lang w:val="de-CH"/>
+            </w:rPr>
+            <w:t>________</w:t>
           </w:r>
         </w:p>
       </w:tc>
@@ -2413,13 +3266,43 @@
           </w:pPr>
           <w:r>
             <w:rPr>
+              <w:rFonts w:ascii="Arial" w:eastAsia="黑体" w:hAnsi="Arial" w:cs="Arial" w:hint="eastAsia"/>
+              <w:bCs/>
+              <w:sz w:val="14"/>
+              <w:szCs w:val="14"/>
+              <w:lang w:val="de-CH"/>
+            </w:rPr>
+            <w:t xml:space="preserve">Checked by / </w:t>
+          </w:r>
+          <w:r>
+            <w:rPr>
               <w:rFonts w:ascii="Arial" w:eastAsia="黑体" w:hAnsi="Arial" w:cs="Arial"/>
               <w:bCs/>
               <w:sz w:val="14"/>
               <w:szCs w:val="14"/>
               <w:lang w:val="de-CH"/>
             </w:rPr>
-            <w:t>Date:_____________________</w:t>
+            <w:t>Date:____</w:t>
+          </w:r>
+          <w:r>
+            <w:rPr>
+              <w:rFonts w:ascii="Arial" w:eastAsia="黑体" w:hAnsi="Arial" w:cs="Arial" w:hint="eastAsia"/>
+              <w:bCs/>
+              <w:sz w:val="14"/>
+              <w:szCs w:val="14"/>
+              <w:lang w:val="de-CH"/>
+            </w:rPr>
+            <w:t>_</w:t>
+          </w:r>
+          <w:r>
+            <w:rPr>
+              <w:rFonts w:ascii="Arial" w:eastAsia="黑体" w:hAnsi="Arial" w:cs="Arial"/>
+              <w:bCs/>
+              <w:sz w:val="14"/>
+              <w:szCs w:val="14"/>
+              <w:lang w:val="de-CH"/>
+            </w:rPr>
+            <w:t>______________</w:t>
           </w:r>
         </w:p>
       </w:tc>
@@ -2431,6 +3314,7 @@
         <w:p>
           <w:pPr>
             <w:pStyle w:val="aa"/>
+            <w:jc w:val="right"/>
             <w:rPr>
               <w:rFonts w:ascii="Arial" w:eastAsia="黑体" w:hAnsi="Arial" w:cs="Arial"/>
               <w:bCs/>
@@ -2447,7 +3331,27 @@
               <w:szCs w:val="14"/>
               <w:lang w:val="de-CH"/>
             </w:rPr>
-            <w:t>Checked by:______________</w:t>
+            <w:t>______________</w:t>
+          </w:r>
+          <w:r>
+            <w:rPr>
+              <w:rFonts w:ascii="Arial" w:eastAsia="黑体" w:hAnsi="Arial" w:cs="Arial" w:hint="eastAsia"/>
+              <w:bCs/>
+              <w:sz w:val="14"/>
+              <w:szCs w:val="14"/>
+              <w:lang w:val="de-CH"/>
+            </w:rPr>
+            <w:t>°</w:t>
+          </w:r>
+          <w:r>
+            <w:rPr>
+              <w:rFonts w:ascii="Arial" w:eastAsia="黑体" w:hAnsi="Arial" w:cs="Arial" w:hint="eastAsia"/>
+              <w:bCs/>
+              <w:sz w:val="14"/>
+              <w:szCs w:val="14"/>
+              <w:lang w:val="de-CH"/>
+            </w:rPr>
+            <w:t>C</w:t>
           </w:r>
         </w:p>
       </w:tc>
@@ -2482,7 +3386,6 @@
             </w:tabs>
             <w:suppressAutoHyphens/>
             <w:spacing w:line="166" w:lineRule="exact"/>
-            <w:jc w:val="center"/>
             <w:rPr>
               <w:rFonts w:ascii="Arial" w:eastAsia="黑体" w:hAnsi="Arial" w:cs="Arial"/>
               <w:bCs/>
@@ -2499,7 +3402,7 @@
               <w:szCs w:val="14"/>
               <w:lang w:val="de-CH"/>
             </w:rPr>
-            <w:t>Date:</w:t>
+            <w:t>____________</w:t>
           </w:r>
           <w:r>
             <w:rPr>
@@ -2509,7 +3412,7 @@
               <w:szCs w:val="14"/>
               <w:lang w:val="de-CH"/>
             </w:rPr>
-            <w:t>____________</w:t>
+            <w:t>_____</w:t>
           </w:r>
           <w:r>
             <w:rPr>
@@ -2519,7 +3422,7 @@
               <w:szCs w:val="14"/>
               <w:lang w:val="de-CH"/>
             </w:rPr>
-            <w:t>_____</w:t>
+            <w:t>%RH</w:t>
           </w:r>
         </w:p>
         <w:p>
@@ -3028,8 +3931,6 @@
               <w:szCs w:val="16"/>
             </w:rPr>
           </w:pPr>
-          <w:bookmarkStart w:id="0" w:name="OLE_LINK4"/>
-          <w:bookmarkStart w:id="1" w:name="OLE_LINK5"/>
           <w:r>
             <w:rPr>
               <w:rFonts w:ascii="Arial Narrow" w:hAnsi="Arial Narrow"/>
@@ -3111,18 +4012,7 @@
               <w:sz w:val="16"/>
               <w:szCs w:val="16"/>
             </w:rPr>
-            <w:t>(2)</w:t>
-          </w:r>
-          <w:bookmarkEnd w:id="0"/>
-          <w:bookmarkEnd w:id="1"/>
-          <w:r>
-            <w:rPr>
-              <w:rFonts w:ascii="Arial Narrow" w:hAnsi="Arial Narrow"/>
-              <w:b/>
-              <w:sz w:val="16"/>
-              <w:szCs w:val="16"/>
-            </w:rPr>
-            <w:t xml:space="preserve"> The results relate only to the Items tested.</w:t>
+            <w:t>(2) The results relate only to the Items tested.</w:t>
           </w:r>
         </w:p>
         <w:p>
@@ -4906,7 +5796,21 @@
               <w:rFonts w:asciiTheme="minorEastAsia" w:eastAsiaTheme="minorEastAsia" w:hAnsiTheme="minorEastAsia" w:cs="Arial" w:hint="eastAsia"/>
               <w:bCs/>
             </w:rPr>
-            <w:t>PHY_000</w:t>
+            <w:t>PHY</w:t>
+          </w:r>
+          <w:r>
+            <w:rPr>
+              <w:rFonts w:asciiTheme="minorEastAsia" w:eastAsiaTheme="minorEastAsia" w:hAnsiTheme="minorEastAsia" w:cs="Arial" w:hint="eastAsia"/>
+              <w:bCs/>
+            </w:rPr>
+            <w:t>-CON_</w:t>
+          </w:r>
+          <w:r>
+            <w:rPr>
+              <w:rFonts w:asciiTheme="minorEastAsia" w:eastAsiaTheme="minorEastAsia" w:hAnsiTheme="minorEastAsia" w:cs="Arial" w:hint="eastAsia"/>
+              <w:bCs/>
+            </w:rPr>
+            <w:t>000</w:t>
           </w:r>
           <w:r>
             <w:rPr>

</xml_diff>

<commit_message>
fix(ParamRule): 自然语言规则支持无ParamStructureId，Formula不存在时返回错误 - ParamRuleApplicationService: Formula 不存在时返回 Result.Fail 而非继续执行 - ParamStructureId 为空时传 null，与 ParamRule.Create 可空设计一致 chore(PhysicalWeight): 仓储补充注释，更新 PHY_Weight 模板
</commit_message>
<xml_diff>
--- a/wwwroot/DocxModel/PHY_Weight.docx
+++ b/wwwroot/DocxModel/PHY_Weight.docx
@@ -32,11 +32,11 @@
         <w:tblLook w:val="04A0" w:firstRow="1" w:lastRow="0" w:firstColumn="1" w:lastColumn="0" w:noHBand="0" w:noVBand="1"/>
       </w:tblPr>
       <w:tblGrid>
-        <w:gridCol w:w="1985"/>
+        <w:gridCol w:w="1701"/>
+        <w:gridCol w:w="709"/>
         <w:gridCol w:w="425"/>
-        <w:gridCol w:w="567"/>
-        <w:gridCol w:w="992"/>
-        <w:gridCol w:w="992"/>
+        <w:gridCol w:w="993"/>
+        <w:gridCol w:w="1133"/>
         <w:gridCol w:w="993"/>
         <w:gridCol w:w="2268"/>
         <w:gridCol w:w="1134"/>
@@ -220,7 +220,7 @@
         </w:trPr>
         <w:tc>
           <w:tcPr>
-            <w:tcW w:w="1985" w:type="dxa"/>
+            <w:tcW w:w="1701" w:type="dxa"/>
           </w:tcPr>
           <w:p>
             <w:pPr>
@@ -246,7 +246,7 @@
         </w:tc>
         <w:tc>
           <w:tcPr>
-            <w:tcW w:w="8505" w:type="dxa"/>
+            <w:tcW w:w="8789" w:type="dxa"/>
             <w:gridSpan w:val="8"/>
           </w:tcPr>
           <w:p>
@@ -291,7 +291,7 @@
         </w:trPr>
         <w:tc>
           <w:tcPr>
-            <w:tcW w:w="1985" w:type="dxa"/>
+            <w:tcW w:w="1701" w:type="dxa"/>
           </w:tcPr>
           <w:p>
             <w:pPr>
@@ -317,7 +317,7 @@
         </w:tc>
         <w:tc>
           <w:tcPr>
-            <w:tcW w:w="992" w:type="dxa"/>
+            <w:tcW w:w="1134" w:type="dxa"/>
             <w:gridSpan w:val="2"/>
           </w:tcPr>
           <w:p>
@@ -362,7 +362,7 @@
         </w:tc>
         <w:tc>
           <w:tcPr>
-            <w:tcW w:w="992" w:type="dxa"/>
+            <w:tcW w:w="993" w:type="dxa"/>
           </w:tcPr>
           <w:p>
             <w:pPr>
@@ -408,7 +408,7 @@
         </w:tc>
         <w:tc>
           <w:tcPr>
-            <w:tcW w:w="992" w:type="dxa"/>
+            <w:tcW w:w="1133" w:type="dxa"/>
           </w:tcPr>
           <w:p>
             <w:pPr>
@@ -559,23 +559,23 @@
         </w:trPr>
         <w:tc>
           <w:tcPr>
-            <w:tcW w:w="1985" w:type="dxa"/>
-          </w:tcPr>
-          <w:p>
-            <w:pPr>
-              <w:spacing w:after="0" w:line="240" w:lineRule="auto"/>
-              <w:jc w:val="center"/>
-              <w:rPr>
-                <w:rFonts w:ascii="Arial" w:eastAsia="黑体" w:hAnsi="Arial" w:cs="Arial"/>
-                <w:sz w:val="20"/>
-                <w:szCs w:val="20"/>
-              </w:rPr>
-            </w:pPr>
-          </w:p>
-        </w:tc>
-        <w:tc>
-          <w:tcPr>
-            <w:tcW w:w="992" w:type="dxa"/>
+            <w:tcW w:w="1701" w:type="dxa"/>
+          </w:tcPr>
+          <w:p>
+            <w:pPr>
+              <w:spacing w:after="0" w:line="240" w:lineRule="auto"/>
+              <w:jc w:val="center"/>
+              <w:rPr>
+                <w:rFonts w:ascii="Arial" w:eastAsia="黑体" w:hAnsi="Arial" w:cs="Arial"/>
+                <w:sz w:val="20"/>
+                <w:szCs w:val="20"/>
+              </w:rPr>
+            </w:pPr>
+          </w:p>
+        </w:tc>
+        <w:tc>
+          <w:tcPr>
+            <w:tcW w:w="1134" w:type="dxa"/>
             <w:gridSpan w:val="2"/>
           </w:tcPr>
           <w:p>
@@ -592,23 +592,23 @@
         </w:tc>
         <w:tc>
           <w:tcPr>
-            <w:tcW w:w="992" w:type="dxa"/>
-          </w:tcPr>
-          <w:p>
-            <w:pPr>
-              <w:spacing w:after="0" w:line="240" w:lineRule="auto"/>
-              <w:jc w:val="center"/>
-              <w:rPr>
-                <w:rFonts w:ascii="Arial" w:eastAsia="黑体" w:hAnsi="Arial" w:cs="Arial"/>
-                <w:sz w:val="20"/>
-                <w:szCs w:val="20"/>
-              </w:rPr>
-            </w:pPr>
-          </w:p>
-        </w:tc>
-        <w:tc>
-          <w:tcPr>
-            <w:tcW w:w="992" w:type="dxa"/>
+            <w:tcW w:w="993" w:type="dxa"/>
+          </w:tcPr>
+          <w:p>
+            <w:pPr>
+              <w:spacing w:after="0" w:line="240" w:lineRule="auto"/>
+              <w:jc w:val="center"/>
+              <w:rPr>
+                <w:rFonts w:ascii="Arial" w:eastAsia="黑体" w:hAnsi="Arial" w:cs="Arial"/>
+                <w:sz w:val="20"/>
+                <w:szCs w:val="20"/>
+              </w:rPr>
+            </w:pPr>
+          </w:p>
+        </w:tc>
+        <w:tc>
+          <w:tcPr>
+            <w:tcW w:w="1133" w:type="dxa"/>
           </w:tcPr>
           <w:p>
             <w:pPr>
@@ -694,23 +694,23 @@
         </w:trPr>
         <w:tc>
           <w:tcPr>
-            <w:tcW w:w="1985" w:type="dxa"/>
-          </w:tcPr>
-          <w:p>
-            <w:pPr>
-              <w:spacing w:after="0" w:line="240" w:lineRule="auto"/>
-              <w:jc w:val="center"/>
-              <w:rPr>
-                <w:rFonts w:ascii="Arial" w:eastAsia="黑体" w:hAnsi="Arial" w:cs="Arial"/>
-                <w:sz w:val="20"/>
-                <w:szCs w:val="20"/>
-              </w:rPr>
-            </w:pPr>
-          </w:p>
-        </w:tc>
-        <w:tc>
-          <w:tcPr>
-            <w:tcW w:w="992" w:type="dxa"/>
+            <w:tcW w:w="1701" w:type="dxa"/>
+          </w:tcPr>
+          <w:p>
+            <w:pPr>
+              <w:spacing w:after="0" w:line="240" w:lineRule="auto"/>
+              <w:jc w:val="center"/>
+              <w:rPr>
+                <w:rFonts w:ascii="Arial" w:eastAsia="黑体" w:hAnsi="Arial" w:cs="Arial"/>
+                <w:sz w:val="20"/>
+                <w:szCs w:val="20"/>
+              </w:rPr>
+            </w:pPr>
+          </w:p>
+        </w:tc>
+        <w:tc>
+          <w:tcPr>
+            <w:tcW w:w="1134" w:type="dxa"/>
             <w:gridSpan w:val="2"/>
           </w:tcPr>
           <w:p>
@@ -727,23 +727,23 @@
         </w:tc>
         <w:tc>
           <w:tcPr>
-            <w:tcW w:w="992" w:type="dxa"/>
-          </w:tcPr>
-          <w:p>
-            <w:pPr>
-              <w:spacing w:after="0" w:line="240" w:lineRule="auto"/>
-              <w:jc w:val="center"/>
-              <w:rPr>
-                <w:rFonts w:ascii="Arial" w:eastAsia="黑体" w:hAnsi="Arial" w:cs="Arial"/>
-                <w:sz w:val="20"/>
-                <w:szCs w:val="20"/>
-              </w:rPr>
-            </w:pPr>
-          </w:p>
-        </w:tc>
-        <w:tc>
-          <w:tcPr>
-            <w:tcW w:w="992" w:type="dxa"/>
+            <w:tcW w:w="993" w:type="dxa"/>
+          </w:tcPr>
+          <w:p>
+            <w:pPr>
+              <w:spacing w:after="0" w:line="240" w:lineRule="auto"/>
+              <w:jc w:val="center"/>
+              <w:rPr>
+                <w:rFonts w:ascii="Arial" w:eastAsia="黑体" w:hAnsi="Arial" w:cs="Arial"/>
+                <w:sz w:val="20"/>
+                <w:szCs w:val="20"/>
+              </w:rPr>
+            </w:pPr>
+          </w:p>
+        </w:tc>
+        <w:tc>
+          <w:tcPr>
+            <w:tcW w:w="1133" w:type="dxa"/>
           </w:tcPr>
           <w:p>
             <w:pPr>
@@ -829,23 +829,23 @@
         </w:trPr>
         <w:tc>
           <w:tcPr>
-            <w:tcW w:w="1985" w:type="dxa"/>
-          </w:tcPr>
-          <w:p>
-            <w:pPr>
-              <w:spacing w:after="0" w:line="240" w:lineRule="auto"/>
-              <w:jc w:val="center"/>
-              <w:rPr>
-                <w:rFonts w:ascii="Arial" w:eastAsia="黑体" w:hAnsi="Arial" w:cs="Arial"/>
-                <w:sz w:val="20"/>
-                <w:szCs w:val="20"/>
-              </w:rPr>
-            </w:pPr>
-          </w:p>
-        </w:tc>
-        <w:tc>
-          <w:tcPr>
-            <w:tcW w:w="992" w:type="dxa"/>
+            <w:tcW w:w="1701" w:type="dxa"/>
+          </w:tcPr>
+          <w:p>
+            <w:pPr>
+              <w:spacing w:after="0" w:line="240" w:lineRule="auto"/>
+              <w:jc w:val="center"/>
+              <w:rPr>
+                <w:rFonts w:ascii="Arial" w:eastAsia="黑体" w:hAnsi="Arial" w:cs="Arial"/>
+                <w:sz w:val="20"/>
+                <w:szCs w:val="20"/>
+              </w:rPr>
+            </w:pPr>
+          </w:p>
+        </w:tc>
+        <w:tc>
+          <w:tcPr>
+            <w:tcW w:w="1134" w:type="dxa"/>
             <w:gridSpan w:val="2"/>
           </w:tcPr>
           <w:p>
@@ -862,23 +862,23 @@
         </w:tc>
         <w:tc>
           <w:tcPr>
-            <w:tcW w:w="992" w:type="dxa"/>
-          </w:tcPr>
-          <w:p>
-            <w:pPr>
-              <w:spacing w:after="0" w:line="240" w:lineRule="auto"/>
-              <w:jc w:val="center"/>
-              <w:rPr>
-                <w:rFonts w:ascii="Arial" w:eastAsia="黑体" w:hAnsi="Arial" w:cs="Arial"/>
-                <w:sz w:val="20"/>
-                <w:szCs w:val="20"/>
-              </w:rPr>
-            </w:pPr>
-          </w:p>
-        </w:tc>
-        <w:tc>
-          <w:tcPr>
-            <w:tcW w:w="992" w:type="dxa"/>
+            <w:tcW w:w="993" w:type="dxa"/>
+          </w:tcPr>
+          <w:p>
+            <w:pPr>
+              <w:spacing w:after="0" w:line="240" w:lineRule="auto"/>
+              <w:jc w:val="center"/>
+              <w:rPr>
+                <w:rFonts w:ascii="Arial" w:eastAsia="黑体" w:hAnsi="Arial" w:cs="Arial"/>
+                <w:sz w:val="20"/>
+                <w:szCs w:val="20"/>
+              </w:rPr>
+            </w:pPr>
+          </w:p>
+        </w:tc>
+        <w:tc>
+          <w:tcPr>
+            <w:tcW w:w="1133" w:type="dxa"/>
           </w:tcPr>
           <w:p>
             <w:pPr>
@@ -964,23 +964,23 @@
         </w:trPr>
         <w:tc>
           <w:tcPr>
-            <w:tcW w:w="1985" w:type="dxa"/>
-          </w:tcPr>
-          <w:p>
-            <w:pPr>
-              <w:spacing w:after="0" w:line="240" w:lineRule="auto"/>
-              <w:jc w:val="center"/>
-              <w:rPr>
-                <w:rFonts w:ascii="Arial" w:eastAsia="黑体" w:hAnsi="Arial" w:cs="Arial"/>
-                <w:sz w:val="20"/>
-                <w:szCs w:val="20"/>
-              </w:rPr>
-            </w:pPr>
-          </w:p>
-        </w:tc>
-        <w:tc>
-          <w:tcPr>
-            <w:tcW w:w="992" w:type="dxa"/>
+            <w:tcW w:w="1701" w:type="dxa"/>
+          </w:tcPr>
+          <w:p>
+            <w:pPr>
+              <w:spacing w:after="0" w:line="240" w:lineRule="auto"/>
+              <w:jc w:val="center"/>
+              <w:rPr>
+                <w:rFonts w:ascii="Arial" w:eastAsia="黑体" w:hAnsi="Arial" w:cs="Arial"/>
+                <w:sz w:val="20"/>
+                <w:szCs w:val="20"/>
+              </w:rPr>
+            </w:pPr>
+          </w:p>
+        </w:tc>
+        <w:tc>
+          <w:tcPr>
+            <w:tcW w:w="1134" w:type="dxa"/>
             <w:gridSpan w:val="2"/>
           </w:tcPr>
           <w:p>
@@ -997,23 +997,23 @@
         </w:tc>
         <w:tc>
           <w:tcPr>
-            <w:tcW w:w="992" w:type="dxa"/>
-          </w:tcPr>
-          <w:p>
-            <w:pPr>
-              <w:spacing w:after="0" w:line="240" w:lineRule="auto"/>
-              <w:jc w:val="center"/>
-              <w:rPr>
-                <w:rFonts w:ascii="Arial" w:eastAsia="黑体" w:hAnsi="Arial" w:cs="Arial"/>
-                <w:sz w:val="20"/>
-                <w:szCs w:val="20"/>
-              </w:rPr>
-            </w:pPr>
-          </w:p>
-        </w:tc>
-        <w:tc>
-          <w:tcPr>
-            <w:tcW w:w="992" w:type="dxa"/>
+            <w:tcW w:w="993" w:type="dxa"/>
+          </w:tcPr>
+          <w:p>
+            <w:pPr>
+              <w:spacing w:after="0" w:line="240" w:lineRule="auto"/>
+              <w:jc w:val="center"/>
+              <w:rPr>
+                <w:rFonts w:ascii="Arial" w:eastAsia="黑体" w:hAnsi="Arial" w:cs="Arial"/>
+                <w:sz w:val="20"/>
+                <w:szCs w:val="20"/>
+              </w:rPr>
+            </w:pPr>
+          </w:p>
+        </w:tc>
+        <w:tc>
+          <w:tcPr>
+            <w:tcW w:w="1133" w:type="dxa"/>
           </w:tcPr>
           <w:p>
             <w:pPr>
@@ -1099,23 +1099,23 @@
         </w:trPr>
         <w:tc>
           <w:tcPr>
-            <w:tcW w:w="1985" w:type="dxa"/>
-          </w:tcPr>
-          <w:p>
-            <w:pPr>
-              <w:spacing w:after="0" w:line="240" w:lineRule="auto"/>
-              <w:jc w:val="center"/>
-              <w:rPr>
-                <w:rFonts w:ascii="Arial" w:eastAsia="黑体" w:hAnsi="Arial" w:cs="Arial"/>
-                <w:sz w:val="20"/>
-                <w:szCs w:val="20"/>
-              </w:rPr>
-            </w:pPr>
-          </w:p>
-        </w:tc>
-        <w:tc>
-          <w:tcPr>
-            <w:tcW w:w="992" w:type="dxa"/>
+            <w:tcW w:w="1701" w:type="dxa"/>
+          </w:tcPr>
+          <w:p>
+            <w:pPr>
+              <w:spacing w:after="0" w:line="240" w:lineRule="auto"/>
+              <w:jc w:val="center"/>
+              <w:rPr>
+                <w:rFonts w:ascii="Arial" w:eastAsia="黑体" w:hAnsi="Arial" w:cs="Arial"/>
+                <w:sz w:val="20"/>
+                <w:szCs w:val="20"/>
+              </w:rPr>
+            </w:pPr>
+          </w:p>
+        </w:tc>
+        <w:tc>
+          <w:tcPr>
+            <w:tcW w:w="1134" w:type="dxa"/>
             <w:gridSpan w:val="2"/>
           </w:tcPr>
           <w:p>
@@ -1132,23 +1132,23 @@
         </w:tc>
         <w:tc>
           <w:tcPr>
-            <w:tcW w:w="992" w:type="dxa"/>
-          </w:tcPr>
-          <w:p>
-            <w:pPr>
-              <w:spacing w:after="0" w:line="240" w:lineRule="auto"/>
-              <w:jc w:val="center"/>
-              <w:rPr>
-                <w:rFonts w:ascii="Arial" w:eastAsia="黑体" w:hAnsi="Arial" w:cs="Arial"/>
-                <w:sz w:val="20"/>
-                <w:szCs w:val="20"/>
-              </w:rPr>
-            </w:pPr>
-          </w:p>
-        </w:tc>
-        <w:tc>
-          <w:tcPr>
-            <w:tcW w:w="992" w:type="dxa"/>
+            <w:tcW w:w="993" w:type="dxa"/>
+          </w:tcPr>
+          <w:p>
+            <w:pPr>
+              <w:spacing w:after="0" w:line="240" w:lineRule="auto"/>
+              <w:jc w:val="center"/>
+              <w:rPr>
+                <w:rFonts w:ascii="Arial" w:eastAsia="黑体" w:hAnsi="Arial" w:cs="Arial"/>
+                <w:sz w:val="20"/>
+                <w:szCs w:val="20"/>
+              </w:rPr>
+            </w:pPr>
+          </w:p>
+        </w:tc>
+        <w:tc>
+          <w:tcPr>
+            <w:tcW w:w="1133" w:type="dxa"/>
           </w:tcPr>
           <w:p>
             <w:pPr>
@@ -1234,23 +1234,23 @@
         </w:trPr>
         <w:tc>
           <w:tcPr>
-            <w:tcW w:w="1985" w:type="dxa"/>
-          </w:tcPr>
-          <w:p>
-            <w:pPr>
-              <w:spacing w:after="0" w:line="240" w:lineRule="auto"/>
-              <w:jc w:val="center"/>
-              <w:rPr>
-                <w:rFonts w:ascii="Arial" w:eastAsia="黑体" w:hAnsi="Arial" w:cs="Arial"/>
-                <w:sz w:val="20"/>
-                <w:szCs w:val="20"/>
-              </w:rPr>
-            </w:pPr>
-          </w:p>
-        </w:tc>
-        <w:tc>
-          <w:tcPr>
-            <w:tcW w:w="992" w:type="dxa"/>
+            <w:tcW w:w="1701" w:type="dxa"/>
+          </w:tcPr>
+          <w:p>
+            <w:pPr>
+              <w:spacing w:after="0" w:line="240" w:lineRule="auto"/>
+              <w:jc w:val="center"/>
+              <w:rPr>
+                <w:rFonts w:ascii="Arial" w:eastAsia="黑体" w:hAnsi="Arial" w:cs="Arial"/>
+                <w:sz w:val="20"/>
+                <w:szCs w:val="20"/>
+              </w:rPr>
+            </w:pPr>
+          </w:p>
+        </w:tc>
+        <w:tc>
+          <w:tcPr>
+            <w:tcW w:w="1134" w:type="dxa"/>
             <w:gridSpan w:val="2"/>
           </w:tcPr>
           <w:p>
@@ -1267,23 +1267,23 @@
         </w:tc>
         <w:tc>
           <w:tcPr>
-            <w:tcW w:w="992" w:type="dxa"/>
-          </w:tcPr>
-          <w:p>
-            <w:pPr>
-              <w:spacing w:after="0" w:line="240" w:lineRule="auto"/>
-              <w:jc w:val="center"/>
-              <w:rPr>
-                <w:rFonts w:ascii="Arial" w:eastAsia="黑体" w:hAnsi="Arial" w:cs="Arial"/>
-                <w:sz w:val="20"/>
-                <w:szCs w:val="20"/>
-              </w:rPr>
-            </w:pPr>
-          </w:p>
-        </w:tc>
-        <w:tc>
-          <w:tcPr>
-            <w:tcW w:w="992" w:type="dxa"/>
+            <w:tcW w:w="993" w:type="dxa"/>
+          </w:tcPr>
+          <w:p>
+            <w:pPr>
+              <w:spacing w:after="0" w:line="240" w:lineRule="auto"/>
+              <w:jc w:val="center"/>
+              <w:rPr>
+                <w:rFonts w:ascii="Arial" w:eastAsia="黑体" w:hAnsi="Arial" w:cs="Arial"/>
+                <w:sz w:val="20"/>
+                <w:szCs w:val="20"/>
+              </w:rPr>
+            </w:pPr>
+          </w:p>
+        </w:tc>
+        <w:tc>
+          <w:tcPr>
+            <w:tcW w:w="1133" w:type="dxa"/>
           </w:tcPr>
           <w:p>
             <w:pPr>
@@ -1775,7 +1775,7 @@
             <w:pPr>
               <w:spacing w:after="0" w:line="240" w:lineRule="auto"/>
               <w:rPr>
-                <w:rFonts w:ascii="Arial" w:hAnsi="Arial" w:cs="Arial" w:hint="eastAsia"/>
+                <w:rFonts w:ascii="Arial" w:hAnsi="Arial" w:cs="Arial"/>
               </w:rPr>
             </w:pPr>
           </w:p>

</xml_diff>